<commit_message>
chore: redact personal info from docx reports
</commit_message>
<xml_diff>
--- a/商务智能方法与应用课程设计报告_无附录.docx
+++ b/商务智能方法与应用课程设计报告_无附录.docx
@@ -264,7 +264,7 @@
                 <w:sz w:val="30"/>
                 <w:lang w:eastAsia="zh-CN"/>
               </w:rPr>
-              <w:t>2308080119</w:t>
+              <w:t>**********</w:t>
             </w:r>
           </w:p>
         </w:tc>
@@ -328,7 +328,7 @@
                 <w:sz w:val="30"/>
                 <w:lang w:eastAsia="zh-CN"/>
               </w:rPr>
-              <w:t>王睿彬</w:t>
+              <w:t>***</w:t>
             </w:r>
           </w:p>
         </w:tc>

</xml_diff>